<commit_message>
Close R1#7 and R2 Exp#2 from S. Cai's answers: SME heating 50C/s 10s hold, E8/E8M + method citation (Cai SMS 2024) into Sec 2.4 and both letters; pair rebuilt at 452 revisions
</commit_message>
<xml_diff>
--- a/submissions/JMRT-R1-resubmission/Cai_Fe-SMA_JMRT_R1_response-reviewer-1.docx
+++ b/submissions/JMRT-R1-resubmission/Cai_Fe-SMA_JMRT_R1_response-reviewer-1.docx
@@ -1149,20 +1149,7 @@
         <w:t xml:space="preserve"> </w:t>
       </w:r>
       <w:r>
-        <w:t xml:space="preserve">We agree these details belong in Section 2.4 and we have added them. The heating stage was performed with</w:t>
-      </w:r>
-      <w:r>
-        <w:t xml:space="preserve"> </w:t>
-      </w:r>
-      <w:r>
-        <w:rPr>
-          <w:b/>
-          <w:bCs/>
-        </w:rPr>
-        <w:t xml:space="preserve">[PENDING — S. Cai: heating method (hot-air gun / furnace), ramp rate, hold time at ≈200 °C; insert here and in Sec. 2.4 before submission — do not submit this letter with this placeholder in place]</w:t>
-      </w:r>
-      <w:r>
-        <w:t xml:space="preserve">. Section 2.4 has also been rewritten to remove an ambiguity in the same paragraph: it now states explicitly that the specimen was unloaded to zero stress and the crosshead then returned to its starting position (nominal zero strain), which is the state in which heating was applied. We note that the same protocol applied to the benchmark alloy did trigger a resolvable reverse transformation (0.5% recovery on heating, Fig. 3b), which is the internal evidence that the heating stage as executed was sufficient to reverse retained stress-induced martensite where such martensite existed.</w:t>
+        <w:t xml:space="preserve">We agree these details belong in Section 2.4 and we have added them. The specimen was heated to ≈200 °C at a rate of ≈50 °C s⁻¹ and held for ≈10 s at temperature before reloading. On whether this was sufficient to fully trigger the reverse transformation, which is the substance of the Reviewer’s question: at the wire’s 0.36 mm diameter the cross-section reaches temperature in a small fraction of the hold, so the specimen genuinely experienced ≈10 s at ≈200 °C rather than a surface excursion. Section 2.4 has also been rewritten to remove an ambiguity in the same paragraph: it now states explicitly that the specimen was unloaded to zero stress and the crosshead then returned to its starting position (nominal zero strain), which is the state in which heating was applied. We note that the same protocol applied to the benchmark alloy did trigger a resolvable reverse transformation (0.5% recovery on heating, Fig. 3b), which is the internal evidence that the heating stage as executed was sufficient to reverse retained stress-induced martensite where such martensite existed.</w:t>
       </w:r>
     </w:p>
     <w:p>

</xml_diff>

<commit_message>
Strip Omori characterization per F. Cai: Fig 3 back to two panels, Fig 10 LLM-only three panels, R3#7 answered by deliberate refusal with scope argument; pair at 445 revisions
</commit_message>
<xml_diff>
--- a/submissions/JMRT-R1-resubmission/Cai_Fe-SMA_JMRT_R1_response-reviewer-1.docx
+++ b/submissions/JMRT-R1-resubmission/Cai_Fe-SMA_JMRT_R1_response-reviewer-1.docx
@@ -545,15 +545,15 @@
         <w:t xml:space="preserve">“Response to the abnormal-grain-growth treatment”</w:t>
       </w:r>
       <w:r>
-        <w:t xml:space="preserve">) and new Fig. 10 present, after the identical three-cycle treatment: the benchmark in the bamboo condition, grains spanning its full 0.64 mm section (Fig. 10a); the LLM-alloy wire, which retains a fine banded duplex structure across its entire 330 µm section with no grain approaching the section width (Fig. 10b); the LLM-alloy at ≈1 mm rod section, where coarsening has occurred but is arrested along a continuous band of fine equiaxed grains (Fig. 10c); and boundary cracking on the rod surface after the treatment plus the 200 °C/3 h age (Fig. 10d). New Fig. 8 adds the synchrotron diffraction pattern of the AGG-treated LLM-alloy, and Fig. 1d its optical microstructure.</w:t>
-      </w:r>
-    </w:p>
-    <w:p>
-      <w:pPr>
-        <w:pStyle w:val="BodyText"/>
-      </w:pPr>
-      <w:r>
-        <w:t xml:space="preserve">Fig. 10c answers the mechanistic part of the comment directly, and Section 3.5 develops it in the terms the Reviewer asks for. Grain growth in this alloy is not absent but</w:t>
+        <w:t xml:space="preserve">) and new Fig. 10 present the AI-designed alloy after the identical three-cycle treatment — which is the microstructure the Reviewer asks to see: the wire, which retains a fine banded duplex structure across its entire 330 µm section with no grain approaching the section width (Fig. 10a); the alloy at ≈1 mm rod section, where coarsening has occurred but is arrested along a continuous band of fine equiaxed grains (Fig. 10b); and boundary cracking on the rod surface after the treatment plus the 200 °C/3 h age (Fig. 10c). The benchmark’s response to the same treatment — complete bamboo formation, grains spanning its full 0.64 mm section — is stated in Sec. 3.5; it reproduces the well-documented behaviour of that composition and is deliberately not presented as a figure, since it is not a finding of this paper. New Fig. 8 adds the synchrotron diffraction pattern of the AGG-treated LLM-alloy, and Fig. 1d its optical microstructure.</w:t>
+      </w:r>
+    </w:p>
+    <w:p>
+      <w:pPr>
+        <w:pStyle w:val="BodyText"/>
+      </w:pPr>
+      <w:r>
+        <w:t xml:space="preserve">Fig. 10b answers the mechanistic part of the comment directly, and Section 3.5 develops it in the terms the Reviewer asks for. Grain growth in this alloy is not absent but</w:t>
       </w:r>
       <w:r>
         <w:t xml:space="preserve"> </w:t>
@@ -594,7 +594,7 @@
         <w:t xml:space="preserve"> </w:t>
       </w:r>
       <w:r>
-        <w:t xml:space="preserve">It does coarsen — Fig. 10c shows it plainly at rod section, and the post-AGG diffraction pattern resolves into markedly more discrete spots than Fig. 4a, the signature of fewer and larger crystallites (Sec. 3.3, Fig. 8). What it does not form is</w:t>
+        <w:t xml:space="preserve">It does coarsen — Fig. 10b shows it plainly at rod section, and the post-AGG diffraction pattern resolves into markedly more discrete spots than Fig. 4a, the signature of fewer and larger crystallites (Sec. 3.3, Fig. 8). What it does not form is</w:t>
       </w:r>
       <w:r>
         <w:t xml:space="preserve"> </w:t>
@@ -618,7 +618,7 @@
         <w:pStyle w:val="BodyText"/>
       </w:pPr>
       <w:r>
-        <w:t xml:space="preserve">Second, on the interpretation: we do not believe the absence of bamboo constitutes a second, independent mode of failure, and we have not written it as one. Bamboo structure does not confer a transformation — it removes the inter-granular constraint that limits one, and so raises the recoverable strain of a material that already transforms. The benchmark demonstrates this within our own data set: none of the three single-anneal benchmark conditions in Fig. 3 is a bamboo structure, yet the benchmark transforms in all three (≈0.5%, ≈0.44% and ≈0.09% recoverable strain, Sec. 3.2), against the 5–8% this composition reaches once bamboo is developed. The tendency is detectable an order of magnitude below the grain structure that optimises it. In the LLM-alloy no such signal appears anywhere — not across the anneal conditions of Table 2, not with the 200 °C/3 h age, and not after the AGG treatment. Abnormal grain growth multiplies a transformation strain; there is nothing here for it to multiply. Section 3.5 additionally reports that coarsening embrittles this alloy (elongation 11.0% → 1.4% between the 1-minute and 40-minute anneals at 1200 °C, at ≈1 mm rod diameter with the same age applied), so the bamboo route would cost the alloy its ductility long before bamboo dimensions were reached. Both failures — the missing transformation and the arrested, embrittling coarsening — trace to the same duplex constitution, which is, we believe, a stronger statement than two independent failure modes: one diagnosis accounts for both observations, and a phase-stability screen would have raised both before any metal was melted (Sec. 4.4).</w:t>
+        <w:t xml:space="preserve">Second, on the interpretation: we do not believe the absence of bamboo constitutes a second, independent mode of failure, and we have not written it as one. Bamboo structure does not confer a transformation — it removes the inter-granular constraint that limits one, and so raises the recoverable strain of a material that already transforms. The benchmark demonstrates this within our own data set: the single-anneal benchmark condition of Fig. 3b is not a bamboo structure, yet the benchmark transforms there (≈0.5% recoverable strain on heating, Sec. 3.2), against the 5–8% this composition reaches once bamboo is developed. The tendency is detectable an order of magnitude below the grain structure that optimises it. In the LLM-alloy no such signal appears anywhere — not across the anneal conditions of Table 2, not with the 200 °C/3 h age, and not after the AGG treatment. Abnormal grain growth multiplies a transformation strain; there is nothing here for it to multiply. Section 3.5 additionally reports that coarsening embrittles this alloy (elongation 11.0% → 1.4% between the 1-minute and 40-minute anneals at 1200 °C, at ≈1 mm rod diameter with the same age applied), so the bamboo route would cost the alloy its ductility long before bamboo dimensions were reached. Both failures — the missing transformation and the arrested, embrittling coarsening — trace to the same duplex constitution, which is, we believe, a stronger statement than two independent failure modes: one diagnosis accounts for both observations, and a phase-stability screen would have raised both before any metal was melted (Sec. 4.4).</w:t>
       </w:r>
     </w:p>
     <w:p>

</xml_diff>

<commit_message>
Remove Fig 10 entirely (Fig 1d + Fig 8 carry the post-AGG evidence); trim R1/R3 letters ~15%; harden build_docx_pair against attaching to user Word session
</commit_message>
<xml_diff>
--- a/submissions/JMRT-R1-resubmission/Cai_Fe-SMA_JMRT_R1_response-reviewer-1.docx
+++ b/submissions/JMRT-R1-resubmission/Cai_Fe-SMA_JMRT_R1_response-reviewer-1.docx
@@ -71,7 +71,7 @@
         <w:pStyle w:val="BodyText"/>
       </w:pPr>
       <w:r>
-        <w:t xml:space="preserve">Section and figure numbers below refer to the revised manuscript unless stated otherwise. The revision renames the alloys (comment 5), adds two Methods subsections (2.6, thermodynamic calculations, and an expanded 2.1), two Results sections (3.4, equilibrium phase stability; 3.5, response to the abnormal-grain-growth treatment), and four figures: Fig. 7 (inverse pole figures), Fig. 8 (post-AGG diffraction), Fig. 9 (equilibrium step diagrams) and Fig. 10 (post-AGG microstructures). The Discussion sections have renumbered accordingly: the AI-implications discussion the Reviewer cites as Section 4.3 is now Section 4.4.</w:t>
+        <w:t xml:space="preserve">Section and figure numbers below refer to the revised manuscript unless stated otherwise. The revision renames the alloys (comment 5), adds two Methods subsections (2.6, thermodynamic calculations, and an expanded 2.1), two Results sections (3.4, equilibrium phase stability; 3.5, response to the abnormal-grain-growth treatment), and three figures: Fig. 7 (inverse pole figures), Fig. 8 (post-AGG diffraction) and Fig. 9 (equilibrium step diagrams); the existing Fig. 1 gains the post-AGG optical microstructure as panel 1d. The Discussion sections have renumbered accordingly: the AI-implications discussion the Reviewer cites as Section 4.3 is now Section 4.4.</w:t>
       </w:r>
     </w:p>
     <w:p>
@@ -146,15 +146,15 @@
         <w:t xml:space="preserve"> </w:t>
       </w:r>
       <w:r>
-        <w:t xml:space="preserve">We agree that the submitted manuscript asserted a causal role for carbon that a two-heat comparison cannot support, and the revision does both of the things the Reviewer asks: it supplies a control, and it tempers the claim to exactly what that control establishes.</w:t>
-      </w:r>
-    </w:p>
-    <w:p>
-      <w:pPr>
-        <w:pStyle w:val="BodyText"/>
-      </w:pPr>
-      <w:r>
-        <w:t xml:space="preserve">The control is the one the Reviewer describes — the alloy without its carbon addition — performed in silico rather than in the furnace. Section 2.6 defines a virtual composition consisting of the</w:t>
+        <w:t xml:space="preserve">We agree that a two-heat comparison cannot support the causal role the submitted manuscript asserted for carbon, and the revision does both of the things the Reviewer asks: it supplies a control, and it tempers the claim to what that control establishes.</w:t>
+      </w:r>
+    </w:p>
+    <w:p>
+      <w:pPr>
+        <w:pStyle w:val="BodyText"/>
+      </w:pPr>
+      <w:r>
+        <w:t xml:space="preserve">The control is the one the Reviewer describes — the alloy without its carbon addition — performed in silico. Section 2.6 defines a virtual composition consisting of the</w:t>
       </w:r>
       <w:r>
         <w:t xml:space="preserve"> </w:t>
@@ -170,23 +170,15 @@
         <w:t xml:space="preserve"> </w:t>
       </w:r>
       <w:r>
-        <w:t xml:space="preserve">LLM-alloy chemistry with carbon deleted and every other element held at its measured value, and Section 3.4 evaluates it alongside the two real alloys in three independently assessed thermodynamic databases (mpea-02b, PrecHiMn-04, mc_fe). This construction changes one variable at a time, which no pair of physically cast heats can do. The result is reported in Table 3 and reproduces across all three databases: with carbon present, the LLM-alloy is a two-phase α + γ mixture at the 1200 °C solution-treatment temperature and its single-phase α field does not open until ≈1340 °C, above both the oxidation limit of the process and the ≈1240 °C incipient-melting temperature returned by mc_fe; with carbon deleted, the field opens at ≈1150 °C and the alloy is 100% α at 1200 °C — the same single-phase state the benchmark reaches there. The calculation is validated against the benchmark alloy, for which it independently reproduces the single-phase α field at 1200 °C and the ≈20% ordered bcc observed in Fig. 4c, neither of which was fitted (Sec. 3.4).</w:t>
-      </w:r>
-    </w:p>
-    <w:p>
-      <w:pPr>
-        <w:pStyle w:val="BodyText"/>
-      </w:pPr>
-      <w:r>
-        <w:t xml:space="preserve">Because the Reviewer’s parallel concern about nickel is equally fair (it is raised explicitly by another comment we received), Section 3.4 also reports a nickel scan from 4.2 to 7.8 at% with all other elements held at measured values: with carbon present the α solvus does not move at all across the entire interval, so restoring the benchmark’s own nickel content would not have opened the solution-treatment window by a single degree. Nickel instead controls how much ordered bcc the alloy can form (5.5–13.9% at 700 °C across the same interval). The two elements act on different parts of the problem and are not competing explanations.</w:t>
-      </w:r>
-    </w:p>
-    <w:p>
-      <w:pPr>
-        <w:pStyle w:val="BodyText"/>
-      </w:pPr>
-      <w:r>
-        <w:t xml:space="preserve">The causal claim has been tempered accordingly, in the abstract, Section 4.1, Section 4.2 and the Conclusions. The revision does not claim that carbon caused the failure in general; Section 4.2 states the narrower, defensible form — carbon closes the single-phase α field at the solution-treatment temperature, and without that field the alloy cannot be brought into the parent state that super-elasticity requires, whatever the other elements do elsewhere. It also states the limits explicitly: over roughly 850–1020 °C the carbon-free control is fully austenitic too, so the lower Al and Ni contents do move the α/γ boundary independently of carbon; and a calculated control is not a substitute for the experiment it stands in for. The carbon-free heat the Reviewer describes is named in Sections 4.2 and 4.4 as the direct experimental test, with the calculation credited only with reducing that test from an open compositional search to a single well-specified heat.</w:t>
+        <w:t xml:space="preserve">LLM-alloy chemistry with carbon deleted, and Section 3.4 evaluates it alongside the two real alloys in three independently assessed thermodynamic databases, validated against the benchmark (whose single-phase α field at 1200 °C and ≈20% ordered bcc it reproduces without fitting). The result reproduces across all three databases (Table 3): with carbon present, the LLM-alloy is duplex α + γ at 1200 °C and its single-phase α field does not open until ≈1340 °C — above both the oxidation limit of the process and the calculated incipient-melting temperature; with carbon deleted, the field opens at ≈1150 °C and the alloy is 100% α at 1200 °C, the benchmark’s state. Because nickel is the natural parallel concern, Sec. 3.4 also scans it from 4.2 to 7.8 at%: the α solvus does not move across the entire interval, so restoring the benchmark’s nickel content would not have opened the window by a single degree.</w:t>
+      </w:r>
+    </w:p>
+    <w:p>
+      <w:pPr>
+        <w:pStyle w:val="BodyText"/>
+      </w:pPr>
+      <w:r>
+        <w:t xml:space="preserve">The causal claim is tempered accordingly in the abstract, Secs. 4.1 and 4.2, and the Conclusions, to the narrow form the control supports: carbon closes the single-phase α field at the solution-treatment temperature, and without that field the alloy cannot be brought into the parent state super-elasticity requires. Section 4.2 also states the limits — the lower Al and Ni contents move the α/γ boundary independently of carbon at lower temperatures, and a calculated control is not a substitute for the experiment. The carbon-free heat the Reviewer describes is named in Secs. 4.2 and 4.4 as the direct experimental test, with the calculation credited only with reducing it from an open compositional search to a single well-specified heat.</w:t>
       </w:r>
     </w:p>
     <w:p>
@@ -262,7 +254,7 @@
         <w:pStyle w:val="BodyText"/>
       </w:pPr>
       <w:r>
-        <w:t xml:space="preserve">First, the CALPHAD analysis. New Sections 2.6 and 3.4, Fig. 9 and Table 3 present equilibrium step diagrams (400–1400 °C) for both alloys as cast, computed from the measured ICP-AES chemistries in three independently assessed databases, with only their points of agreement carried into the conclusions. The analysis in fact sharpened the paper’s diagnosis in the direction the Reviewer’s wording anticipates: the problem is not that the LLM-alloy has a BCC parent with</w:t>
+        <w:t xml:space="preserve">First, the CALPHAD analysis. New Sections 2.6 and 3.4, Fig. 9 and Table 3 present equilibrium step diagrams (400–1400 °C) for both alloys, computed from the measured chemistries in three independently assessed databases and validated against the benchmark (whose single-phase α field and ≈20% ordered bcc they reproduce without fitting). The analysis sharpened the diagnosis in the direction the Reviewer’s wording anticipates: the problem is not a BCC parent with</w:t>
       </w:r>
       <w:r>
         <w:t xml:space="preserve"> </w:t>
@@ -275,15 +267,18 @@
         <w:t xml:space="preserve">insufficient driving force</w:t>
       </w:r>
       <w:r>
-        <w:t xml:space="preserve">, but that no accessible heat treatment produces that parent at all. The benchmark solution-treats to single-phase α at 1200 °C and orders on cooling, exactly as its processing route assumes; the LLM-alloy is duplex at 1200 °C, reaches single-phase α only at ≈1340 °C — above both its oxidation limit and its calculated incipient-melting temperature — and has no temperature at which it can be solution-treated to α and then aged to coherent precipitates within that α (Secs. 3.4, 4.1). The calculations are validated against the benchmark, for which they reproduce the observed single-phase field and the ≈20% ordered bcc without any fitting.</w:t>
-      </w:r>
-    </w:p>
-    <w:p>
-      <w:pPr>
-        <w:pStyle w:val="BodyText"/>
-      </w:pPr>
-      <w:r>
-        <w:t xml:space="preserve">Second, the model’s reasoning pathway. The agent’s full 41-page report survives and is now supplied as Supplementary Material (Sec. 2.1), so the Reviewer’s two questions are answered from the document rather than from recollection (Sec. 4.1): (i) Yes — the report specified a BCC parent phase carrying coherent 5–15 nm β precipitates of Ni(Al,Si) type and predicted 5–8% recoverable strain at 400–700 MPa. But it made no prediction of phase fractions, calculated no phase diagram, and identified no solution-treatment window: it named the microstructure it wanted without establishing that the composition could produce it. (ii) No — D0₃ and Fe₃Al occur nowhere in the report. Notably, this is not a general blind spot for ordered Fe-Al chemistry: the report discusses κ-carbide at length and builds one of its six candidate families explicitly on κ-(Fe,Mn,Cr)₃AlC at 5–12 wt% Al, a range that brackets the 6.4 wt% eventually melted. The ordering chemistry was present in the report’s reasoning but attached to a different candidate and not carried across to the one that was made — a failure of transfer rather than of knowledge, which we believe is both a more tractable problem and a more specific caution.</w:t>
+        <w:t xml:space="preserve"> </w:t>
+      </w:r>
+      <w:r>
+        <w:t xml:space="preserve">but that no accessible heat treatment produces that parent at all — the LLM-alloy is duplex at 1200 °C, reaches single-phase α only at ≈1340 °C, above both its oxidation limit and its calculated incipient-melting temperature, and has no temperature at which it can be solution-treated to α and then aged within it (Secs. 3.4, 4.1).</w:t>
+      </w:r>
+    </w:p>
+    <w:p>
+      <w:pPr>
+        <w:pStyle w:val="BodyText"/>
+      </w:pPr>
+      <w:r>
+        <w:t xml:space="preserve">Second, the model’s reasoning pathway. The agent’s full 41-page report survives and is supplied as Supplementary Material, so the Reviewer’s two questions are answered from the document itself (Sec. 4.1): (i) Yes — it specified a BCC parent carrying coherent 5–15 nm β precipitates and predicted 5–8% recoverable strain at 400–700 MPa, but it calculated no phase diagram and identified no solution-treatment window: it named the microstructure it wanted without establishing that the composition could produce it. (ii) No — D0₃ and Fe₃Al occur nowhere in the report, although it discusses κ-carbide ordering at length for a different candidate family: the ordering chemistry was present in its reasoning but not carried across to the composition that was made — a failure of transfer rather than of knowledge.</w:t>
       </w:r>
     </w:p>
     <w:p>
@@ -303,7 +298,7 @@
         <w:t xml:space="preserve"> </w:t>
       </w:r>
       <w:r>
-        <w:t xml:space="preserve">(now Sec. 4.4) have been rewritten around a concrete finding these two analyses produced together: the report’s own recommendations call for CALPHAD screening — the only occurrence of CALPHAD in its forty-one pages is a recommendation for future work, not a calculation performed. The agent specified a parent phase it had not shown to be attainable and, in the same document, correctly identified the calculation that would have shown it. The revised lesson is therefore specific rather than vague: the useful distinction is not between AI-assisted and conventional design but between workflows that terminate in a verified calculation and those that terminate in a plausible narrative, and the screening step that would have caught this composition costs minutes with openly available databases.</w:t>
+        <w:t xml:space="preserve">(Sec. 4.4) are rewritten around the concrete finding these two analyses produce together: the only occurrence of CALPHAD in the report’s forty-one pages is its own recommendation for future work. The agent specified a parent phase it had not shown to be attainable and, in the same document, correctly identified the minutes-long calculation that would have shown it.</w:t>
       </w:r>
     </w:p>
     <w:p>
@@ -392,7 +387,7 @@
         <w:t xml:space="preserve"> </w:t>
       </w:r>
       <w:r>
-        <w:t xml:space="preserve">In this alloy family the parent is BCC α and the martensite is FCC γ — the reverse of the carbon-steel convention, which the revision now states explicitly in Sec. 3.3 — so a structure that is ≈62% γ is one in which most of the material is already in the product phase. The calculations of Sec. 3.4 show why: no accessible temperature produces single-phase α in this composition, so there is no treatment from which a majority-α parent could be retained.</w:t>
+        <w:t xml:space="preserve">In this family the parent is BCC α and the martensite FCC γ — the reverse of the carbon-steel convention, now stated explicitly in Sec. 3.3 — so a structure that is ≈62% γ is mostly product phase already, and Sec. 3.4 shows why: no accessible temperature produces single-phase α in this composition.</w:t>
       </w:r>
     </w:p>
     <w:p>
@@ -407,13 +402,13 @@
           <w:i/>
           <w:iCs/>
         </w:rPr>
-        <w:t xml:space="preserve">The observed γ excess points to a transformation that has already run.</w:t>
-      </w:r>
-      <w:r>
-        <w:t xml:space="preserve"> </w:t>
-      </w:r>
-      <w:r>
-        <w:t xml:space="preserve">The calculations place α in the majority at 1200 °C (62–71%), while the refinement of the quenched wire places γ in the majority (≈62%). Section 4.1 now discusses this discrepancy plainly: a partial α → γ transformation during cooling would invert the ratio, which would put the martensite start temperature above room temperature — meaning the transformation the design intended to trigger by stress had already run before the specimen was loaded, leaving nothing to induce. The lath-like, transformation-refined appearance of the AGG-treated wire (Fig. 1d, discussed in Sec. 3.1) points the same way. We present this as the reading the data favor rather than as established, and we identify calorimetry as the single most informative remaining experiment.</w:t>
+        <w:t xml:space="preserve">The γ excess points to a transformation that has already run.</w:t>
+      </w:r>
+      <w:r>
+        <w:t xml:space="preserve"> </w:t>
+      </w:r>
+      <w:r>
+        <w:t xml:space="preserve">The calculations place α in the majority at 1200 °C (62–71%); the refinement of the quenched wire places γ in the majority (≈62%). Section 4.1 discusses the inversion plainly: a partial α → γ transformation during cooling would put the martensite start above room temperature — the transformation the design intended to trigger by stress had already run before the specimen was loaded. We present this as the reading the data favor, and name calorimetry as the most informative remaining experiment.</w:t>
       </w:r>
     </w:p>
     <w:p>
@@ -434,19 +429,19 @@
         <w:t xml:space="preserve"> </w:t>
       </w:r>
       <w:r>
-        <w:t xml:space="preserve">SEM/EDS (new Fig. 1b) resolves an intimately interlocked two-phase mixture, Al-rich α and Mn-rich γ. We deliberately do not assign either constituent as</w:t>
-      </w:r>
-      <w:r>
-        <w:t xml:space="preserve"> </w:t>
-      </w:r>
-      <w:r>
-        <w:t xml:space="preserve">“matrix,”</w:t>
-      </w:r>
-      <w:r>
-        <w:t xml:space="preserve"> </w:t>
-      </w:r>
-      <w:r>
-        <w:t xml:space="preserve">because a two-dimensional section through an interpenetrating duplex does not establish three-dimensional continuity (Sec. 3.1). What can be said mechanistically is said in Sec. 4.1: transforming the discrete α regions requires the surrounding majority γ to accommodate the shape strain, and γ at these anneal conditions yields at ≈500–670 MPa, so slip in γ preempts any transformation of the α it encloses.</w:t>
+        <w:t xml:space="preserve">SEM/EDS (new Fig. 1b) resolves an intimately interlocked duplex, Al-rich α and Mn-rich γ, with neither assigned as</w:t>
+      </w:r>
+      <w:r>
+        <w:t xml:space="preserve"> </w:t>
+      </w:r>
+      <w:r>
+        <w:t xml:space="preserve">“matrix”</w:t>
+      </w:r>
+      <w:r>
+        <w:t xml:space="preserve"> </w:t>
+      </w:r>
+      <w:r>
+        <w:t xml:space="preserve">(a 2-D section cannot establish 3-D continuity, Sec. 3.1). Mechanistically: transforming the discrete α regions requires the surrounding majority γ to accommodate the shape strain, and γ yields at ≈500–670 MPa, so slip in γ preempts any transformation of the α it encloses (Sec. 4.1).</w:t>
       </w:r>
     </w:p>
     <w:p>
@@ -467,7 +462,7 @@
         <w:t xml:space="preserve"> </w:t>
       </w:r>
       <w:r>
-        <w:t xml:space="preserve">it does not act as the Reviewer’s second alternative proposes. The D0₃ present is a bulk ordered constituent (≈4%), not a fine coherent dispersion, so it does not raise the resistance to plastic flow the way nanoscale B2 does in the benchmark; and Sec. 4.1 now also explains</w:t>
+        <w:t xml:space="preserve">it is a bulk ordered constituent (≈4%), not a fine coherent dispersion, so it does not act as the Reviewer’s second alternative proposes. Section 4.1 also explains</w:t>
       </w:r>
       <w:r>
         <w:t xml:space="preserve"> </w:t>
@@ -483,7 +478,7 @@
         <w:t xml:space="preserve"> </w:t>
       </w:r>
       <w:r>
-        <w:t xml:space="preserve">coherent B2 is unavailable to this composition — coherent B2 requires quenching from a single-phase α field and ageing within it, and this alloy has no such field at any accessible temperature. That statement is stronger than the absence of a B2 reflection alone would support, and it also accounts for the complete failure of the 200 °C/3 h age (Fig. 2h) to produce any response.</w:t>
+        <w:t xml:space="preserve">coherent B2 is unavailable: it requires quenching from a single-phase α field and ageing within it, and this alloy has no such field at any accessible temperature — which also accounts for the complete failure of the 200 °C/3 h age (Fig. 2h).</w:t>
       </w:r>
     </w:p>
     <w:p>
@@ -491,7 +486,7 @@
         <w:pStyle w:val="FirstParagraph"/>
       </w:pPr>
       <w:r>
-        <w:t xml:space="preserve">The post-deformation diffraction (spotty rings broadening into arcs, Fig. 4b; unchanged phase fractions, Fig. 6a) corroborates slip as the operative mechanism, as before.</w:t>
+        <w:t xml:space="preserve">The post-deformation diffraction (Fig. 4b; unchanged phase fractions, Fig. 6a) corroborates slip as the operative mechanism, as before.</w:t>
       </w:r>
     </w:p>
     <w:p>
@@ -531,29 +526,29 @@
         <w:t xml:space="preserve"> </w:t>
       </w:r>
       <w:r>
-        <w:t xml:space="preserve">We agree, and we have made this change. The abnormal-grain-growth result was a single sentence with no supporting figure; it is now a section of its own with two new figures.</w:t>
-      </w:r>
-    </w:p>
-    <w:p>
-      <w:pPr>
-        <w:pStyle w:val="BodyText"/>
-      </w:pPr>
-      <w:r>
-        <w:t xml:space="preserve">New Section 3.5 (</w:t>
+        <w:t xml:space="preserve">We agree, and we have made this change. The abnormal-grain-growth result was a single sentence with no supporting figure; it is now a section of its own, and the microstructure the Reviewer asks to see is now in the figures.</w:t>
+      </w:r>
+    </w:p>
+    <w:p>
+      <w:pPr>
+        <w:pStyle w:val="BodyText"/>
+      </w:pPr>
+      <w:r>
+        <w:t xml:space="preserve">The post-AGG microstructure of the AI-designed alloy is presented twice over: Fig. 1d gives its optical micrograph — a fine banded duplex structure across the entire wire section, no grain approaching the section width — directly comparable, within the same figure, to the 1-minute (Fig. 1a) and 40-minute (Fig. 1c) anneals; and new Fig. 8 gives its synchrotron diffraction pattern, whose resolution of the Debye rings into discrete spots is the grain-size evidence in reciprocal space. New Section 3.5 (</w:t>
       </w:r>
       <w:r>
         <w:t xml:space="preserve">“Response to the abnormal-grain-growth treatment”</w:t>
       </w:r>
       <w:r>
-        <w:t xml:space="preserve">) and new Fig. 10 present the AI-designed alloy after the identical three-cycle treatment — which is the microstructure the Reviewer asks to see: the wire, which retains a fine banded duplex structure across its entire 330 µm section with no grain approaching the section width (Fig. 10a); the alloy at ≈1 mm rod section, where coarsening has occurred but is arrested along a continuous band of fine equiaxed grains (Fig. 10b); and boundary cracking on the rod surface after the treatment plus the 200 °C/3 h age (Fig. 10c). The benchmark’s response to the same treatment — complete bamboo formation, grains spanning its full 0.64 mm section — is stated in Sec. 3.5; it reproduces the well-documented behaviour of that composition and is deliberately not presented as a figure, since it is not a finding of this paper. New Fig. 8 adds the synchrotron diffraction pattern of the AGG-treated LLM-alloy, and Fig. 1d its optical microstructure.</w:t>
-      </w:r>
-    </w:p>
-    <w:p>
-      <w:pPr>
-        <w:pStyle w:val="BodyText"/>
-      </w:pPr>
-      <w:r>
-        <w:t xml:space="preserve">Fig. 10b answers the mechanistic part of the comment directly, and Section 3.5 develops it in the terms the Reviewer asks for. Grain growth in this alloy is not absent but</w:t>
+        <w:t xml:space="preserve">) reports the full record around those figures: at ≈1 mm rod section, optical metallography shows coarsening did occur and is arrested along a continuous band of fine equiaxed grains that the advancing boundaries never consumed; and after the treatment plus the 200 °C/3 h age, boundary cracking is visible on the specimen surface. The benchmark’s response to the same treatment — complete bamboo formation, grains spanning its full 0.64 mm section — is stated in Sec. 3.5; it reproduces the well-documented behaviour of that composition and is deliberately not presented as a figure, since it is not a finding of this paper.</w:t>
+      </w:r>
+    </w:p>
+    <w:p>
+      <w:pPr>
+        <w:pStyle w:val="BodyText"/>
+      </w:pPr>
+      <w:r>
+        <w:t xml:space="preserve">The arrested-coarsening observation answers the mechanistic part of the comment directly, and Section 3.5 develops it in the terms the Reviewer asks for. Grain growth in this alloy is not absent but</w:t>
       </w:r>
       <w:r>
         <w:t xml:space="preserve"> </w:t>
@@ -594,7 +589,7 @@
         <w:t xml:space="preserve"> </w:t>
       </w:r>
       <w:r>
-        <w:t xml:space="preserve">It does coarsen — Fig. 10b shows it plainly at rod section, and the post-AGG diffraction pattern resolves into markedly more discrete spots than Fig. 4a, the signature of fewer and larger crystallites (Sec. 3.3, Fig. 8). What it does not form is</w:t>
+        <w:t xml:space="preserve">It does coarsen — the rod-section metallography reported in Sec. 3.5 shows it plainly, and the post-AGG diffraction pattern resolves into markedly more discrete spots than Fig. 4a, the signature of fewer and larger crystallites (Sec. 3.3, Fig. 8). What it does not form is</w:t>
       </w:r>
       <w:r>
         <w:t xml:space="preserve"> </w:t>

</xml_diff>